<commit_message>
Complete Lab 02 replication report
</commit_message>
<xml_diff>
--- a/replication-lab.docx
+++ b/replication-lab.docx
@@ -182,7 +182,7 @@
         <w:pStyle w:val="FirstParagraph"/>
       </w:pPr>
       <w:r>
-        <w:t xml:space="preserve">In continual and nonstationary machine learning, a fundamental challenge is maintaining the ability to acquire new knowledge over time. While catastrophic forgetting addresses the loss of past representations, recent literature—notably synthesized in the survey by Klein et al.—highlights an equally critical phenomenon:</w:t>
+        <w:t xml:space="preserve">In continual and nonstationary machine learning, a fundamental challenge is maintaining the ability to acquire new knowledge over time. While catastrophic forgetting addresses the loss of past representations, recent literature—notably synthesized in the survey by Klein et al. (2024)—highlights an equally critical phenomenon:</w:t>
       </w:r>
       <w:r>
         <w:t xml:space="preserve"> </w:t>
@@ -195,7 +195,7 @@
         <w:t xml:space="preserve">loss of plasticity</w:t>
       </w:r>
       <w:r>
-        <w:t xml:space="preserve">. Under continual distribution shifts or sequential task regimes, a network may retain strong performance on earlier tasks or features, yet experience a degraded capacity to adapt, recover, or learn subsequent tasks as efficiently as a freshly initialized baseline.</w:t>
+        <w:t xml:space="preserve">. Under continual distribution shifts or sequential task regimes, a network may retain strong performance on earlier tasks or features, yet experience a degraded capacity to adapt, recover, or learn subsequent tasks as efficiently as a freshly initialized baseline (Klein et al., 2024).</w:t>
       </w:r>
     </w:p>
     <w:p>
@@ -251,7 +251,7 @@
         <w:t xml:space="preserve"> </w:t>
       </w:r>
       <w:r>
-        <w:t xml:space="preserve">When a deep learning model experiences nonstationary task or distribution transitions, its ongoing adaptation capacity deteriorates. Specifically, continued gradient updates on earlier distributions cause weight consolidation, feature collapse, or dead activation regimes that slow down or cap the asymptotic learning efficiency on subsequent tasks relative to a newly initialized model.</w:t>
+        <w:t xml:space="preserve">When a deep learning model experiences nonstationary task or distribution transitions, its ongoing adaptation capacity deteriorates (Klein et al., 2024). Specifically, continued gradient updates on earlier distributions cause weight consolidation, feature collapse, or dead activation regimes that slow down or cap the asymptotic learning efficiency on subsequent tasks relative to a newly initialized model.</w:t>
       </w:r>
     </w:p>
     <w:p>
@@ -336,7 +336,7 @@
         <w:t xml:space="preserve"> </w:t>
       </w:r>
       <w:r>
-        <w:t xml:space="preserve">required to attain target accuracy on the new task compared to an identical architecture trained from scratch.</w:t>
+        <w:t xml:space="preserve">required to attain target accuracy on the new task compared to an identical architecture trained from scratch (Klein et al., 2024).</w:t>
       </w:r>
     </w:p>
     <w:p>
@@ -1596,7 +1596,7 @@
         <w:pStyle w:val="FirstParagraph"/>
       </w:pPr>
       <w:r>
-        <w:t xml:space="preserve">The empirical evidence indicates that parameter retention came directly at the expense of adaptive plasticity. The consolidation of representations in early layers constrained subsequent gradient descent paths, causing persistent plasticity loss.</w:t>
+        <w:t xml:space="preserve">The empirical evidence indicates that parameter retention came directly at the expense of adaptive plasticity. The consolidation of representations in early layers constrained subsequent gradient descent paths, causing persistent plasticity loss (Klein et al., 2024).</w:t>
       </w:r>
     </w:p>
     <w:p>
@@ -1706,7 +1706,7 @@
         <w:t xml:space="preserve"> </w:t>
       </w:r>
       <w:r>
-        <w:t xml:space="preserve">* This pattern confirms that naive gradient descent in deep architectures under sequential shifts induces implicit regularization or dead units (loss of effective rank in representation space), restricting ongoing adaptability.</w:t>
+        <w:t xml:space="preserve">* This pattern confirms that naive gradient descent in deep architectures under sequential shifts induces implicit regularization or dead units (loss of effective rank in representation space), restricting ongoing adaptability (Klein et al., 2024).</w:t>
       </w:r>
     </w:p>
     <w:p>
@@ -1775,7 +1775,7 @@
         <w:t xml:space="preserve"> </w:t>
       </w:r>
       <w:r>
-        <w:t xml:space="preserve">(e.g., continual backpropagation, dead neuron re-initialization, or Shrink and Perturb mechanisms) to verify whether resetting inactive units restores the post-shift learning slope to match the scratch baseline.</w:t>
+        <w:t xml:space="preserve">(e.g., continual backpropagation, dead neuron re-initialization, or Shrink and Perturb mechanisms) to verify whether resetting inactive units restores the post-shift learning slope to match the scratch baseline (Klein et al., 2024).</w:t>
       </w:r>
     </w:p>
     <w:p>
@@ -1923,7 +1923,7 @@
         <w:t xml:space="preserve"> </w:t>
       </w:r>
       <w:r>
-        <w:t xml:space="preserve">Because this implementation serves as a proxy replication using a scaled feedforward setup rather than the full suite of extensive reinforcement learning and continuous vision benchmarks evaluated in Klein et al., the verdict is scoped as</w:t>
+        <w:t xml:space="preserve">Because this implementation serves as a proxy replication using a scaled feedforward setup rather than the full suite of extensive reinforcement learning and continuous vision benchmarks evaluated in Klein et al. (2024), the verdict is scoped as</w:t>
       </w:r>
       <w:r>
         <w:t xml:space="preserve"> </w:t>
@@ -1939,8 +1939,46 @@
         <w:t xml:space="preserve">. The primary mechanism is supported within the boundaries of the tested proxy environment.</w:t>
       </w:r>
     </w:p>
+    <w:p>
+      <w:r>
+        <w:pict>
+          <v:rect style="width:0;height:1.5pt" o:hralign="center" o:hrstd="t" o:hr="t"/>
+        </w:pict>
+      </w:r>
+    </w:p>
     <w:bookmarkEnd w:id="36"/>
     <w:bookmarkEnd w:id="37"/>
+    <w:bookmarkStart w:id="38" w:name="references"/>
+    <w:p>
+      <w:pPr>
+        <w:pStyle w:val="Heading1"/>
+      </w:pPr>
+      <w:r>
+        <w:t xml:space="preserve">9. References</w:t>
+      </w:r>
+    </w:p>
+    <w:p>
+      <w:pPr>
+        <w:pStyle w:val="FirstParagraph"/>
+      </w:pPr>
+      <w:r>
+        <w:t xml:space="preserve">Klein, T., Luther, C., McAuliffe, M., Miklautz, L., Plant, C., &amp; Tschiatschek, S. (2024).</w:t>
+      </w:r>
+      <w:r>
+        <w:t xml:space="preserve"> </w:t>
+      </w:r>
+      <w:r>
+        <w:rPr>
+          <w:iCs/>
+          <w:i/>
+        </w:rPr>
+        <w:t xml:space="preserve">Plasticity loss in deep reinforcement learning: A survey</w:t>
+      </w:r>
+      <w:r>
+        <w:t xml:space="preserve">. arXiv. https://arxiv.org/abs/2411.04832</w:t>
+      </w:r>
+    </w:p>
+    <w:bookmarkEnd w:id="38"/>
     <w:sectPr/>
   </w:body>
 </w:document>

</xml_diff>